<commit_message>
Correct ticket-queue claim (familiarity only) across Wordly and Smarsh; record billing-processing gap in profile
Co-Authored-By: Claude Opus 5.5 <noreply@anthropic.com>
Claude-Session: https://claude.ai/code/session_018DEej5NGjq1omj9BTtvEiy
</commit_message>
<xml_diff>
--- a/applications/smarsh-customer-success-representative/Smarsh-CustomerSuccessRep-Resume.docx
+++ b/applications/smarsh-customer-success-representative/Smarsh-CustomerSuccessRep-Resume.docx
@@ -80,7 +80,7 @@
           <w:i w:val="0"/>
           <w:color w:val="1A1A1A"/>
         </w:rPr>
-        <w:t>Customer success professional with 15+ years in B2B SaaS who resolves issues fast and keeps accounts on track. I've worked formal support-ticket queues in Zendesk, handled 50+ partner activities a day at Birdeye while retaining all but one of 15-20 partners (~94%), and logged every interaction in Salesforce at Birdeye and Wix. Regulated-industry exposure includes a banking client at Fetch &amp; Funnel and building compliance systems as co-owner of a licensed, highly regulated retail business.</w:t>
+        <w:t>Customer success professional with 15+ years in B2B SaaS who resolves issues fast and keeps accounts on track. I've handled 50+ partner activities a day at Birdeye while retaining all but one of 15-20 partners (~94%), and logged every interaction in Salesforce at Birdeye and Wix. Regulated-industry exposure includes a banking client at Fetch &amp; Funnel and building compliance systems as co-owner of a licensed, highly regulated retail business.</w:t>
       </w:r>
     </w:p>
     <w:p>
@@ -735,7 +735,7 @@
           <w:i w:val="0"/>
           <w:color w:val="1A1A1A"/>
         </w:rPr>
-        <w:t>Inbound Call &amp; Ticket Resolution (Zendesk), Billing &amp; Invoice Questions, Account Retention, Internal Escalation, Salesforce, HubSpot, Excel</w:t>
+        <w:t>Phone &amp; Issue Resolution, Ticketing (Zendesk), Billing &amp; Invoice Questions, Account Retention, Internal Escalation, Salesforce, HubSpot, Excel</w:t>
       </w:r>
     </w:p>
     <w:p>

</xml_diff>